<commit_message>
add banihashemi to Inlet test ww3 and Sandy
</commit_message>
<xml_diff>
--- a/COAWST_User_Manual.docx
+++ b/COAWST_User_Manual.docx
@@ -4210,6 +4210,67 @@
         <w:ind w:left="2430" w:hanging="2430"/>
       </w:pPr>
       <w:r>
+        <w:t>- To use this option with SWAN, you just need to use #</w:t>
+      </w:r>
+      <w:r>
+        <w:rPr>
+          <w:b/>
+        </w:rPr>
+        <w:t>define UV_</w:t>
+      </w:r>
+      <w:r>
+        <w:rPr>
+          <w:b/>
+        </w:rPr>
+        <w:t>BANIHASHEMI</w:t>
+      </w:r>
+    </w:p>
+    <w:p>
+      <w:pPr>
+        <w:ind w:left="2430" w:hanging="2430"/>
+        <w:rPr>
+          <w:bCs/>
+        </w:rPr>
+      </w:pPr>
+      <w:r>
+        <w:t xml:space="preserve">- To use this option with </w:t>
+      </w:r>
+      <w:r>
+        <w:t>WW3</w:t>
+      </w:r>
+      <w:r>
+        <w:t>, you need to use #</w:t>
+      </w:r>
+      <w:r>
+        <w:rPr>
+          <w:b/>
+        </w:rPr>
+        <w:t>define UV_</w:t>
+      </w:r>
+      <w:r>
+        <w:rPr>
+          <w:b/>
+        </w:rPr>
+        <w:t>BANIHASHEMI</w:t>
+      </w:r>
+      <w:r>
+        <w:rPr>
+          <w:bCs/>
+        </w:rPr>
+        <w:t xml:space="preserve"> and add CURSP </w:t>
+      </w:r>
+      <w:r>
+        <w:rPr>
+          <w:bCs/>
+        </w:rPr>
+        <w:t xml:space="preserve">to the switch file. </w:t>
+      </w:r>
+    </w:p>
+    <w:p>
+      <w:pPr>
+        <w:ind w:left="2430" w:hanging="2430"/>
+      </w:pPr>
+      <w:r>
         <w:t>---  or     ----</w:t>
       </w:r>
     </w:p>
@@ -4607,7 +4668,6 @@
     </w:p>
     <w:p>
       <w:r>
-        <w:lastRenderedPageBreak/>
         <w:t xml:space="preserve">This option </w:t>
       </w:r>
       <w:r>
@@ -5205,6 +5265,7 @@
         <w:jc w:val="both"/>
       </w:pPr>
       <w:r>
+        <w:lastRenderedPageBreak/>
         <w:t xml:space="preserve">If you need any of these _INTERP_ </w:t>
       </w:r>
       <w:proofErr w:type="spellStart"/>
@@ -5239,7 +5300,6 @@
     </w:p>
     <w:p>
       <w:r>
-        <w:lastRenderedPageBreak/>
         <w:t>4.</w:t>
       </w:r>
       <w:r>
@@ -5920,6 +5980,7 @@
     </w:p>
     <w:p>
       <w:r>
+        <w:lastRenderedPageBreak/>
         <w:t>Oost, W. A., G. J. Komen, C. M. J. Jacobs, and C. van Oort, 2002:New evidence for a relation between wind stress and wave age from measurements during ASGAMAGE. Bound.-Layer Meteor., 103, 409-438.</w:t>
       </w:r>
     </w:p>
@@ -7801,555 +7862,555 @@
         <w:rPr>
           <w:b/>
         </w:rPr>
+        <w:t>#define</w:t>
+      </w:r>
+      <w:r>
+        <w:t xml:space="preserve"> </w:t>
+      </w:r>
+      <w:r>
+        <w:rPr>
+          <w:b/>
+        </w:rPr>
+        <w:t>WDISS_WAVEMOD</w:t>
+      </w:r>
+      <w:r>
+        <w:t xml:space="preserve">        get </w:t>
+      </w:r>
+      <w:r>
+        <w:t xml:space="preserve">depth-limited wave breaking </w:t>
+      </w:r>
+      <w:r>
+        <w:t>dissipation from a wave model, use this to get dissipation when coupl</w:t>
+      </w:r>
+      <w:r>
+        <w:t xml:space="preserve">ing </w:t>
+      </w:r>
+      <w:r>
+        <w:t>ROMS to either WW3 or SWAN.</w:t>
+      </w:r>
+    </w:p>
+    <w:p>
+      <w:pPr>
+        <w:ind w:left="3510" w:hanging="3510"/>
+        <w:rPr>
+          <w:b/>
+        </w:rPr>
+      </w:pPr>
+    </w:p>
+    <w:p>
+      <w:pPr>
+        <w:rPr>
+          <w:bCs/>
+        </w:rPr>
+      </w:pPr>
+      <w:r>
+        <w:rPr>
+          <w:bCs/>
+        </w:rPr>
+        <w:t xml:space="preserve">Use </w:t>
+      </w:r>
+      <w:r>
+        <w:rPr>
+          <w:bCs/>
+        </w:rPr>
+        <w:t xml:space="preserve">either of these 2 </w:t>
+      </w:r>
+      <w:r>
+        <w:rPr>
+          <w:bCs/>
+        </w:rPr>
+        <w:t xml:space="preserve">below </w:t>
+      </w:r>
+      <w:r>
+        <w:rPr>
+          <w:bCs/>
+        </w:rPr>
+        <w:t>when you are not getting depth limited wave breaking dissipation (</w:t>
+      </w:r>
+      <w:proofErr w:type="spellStart"/>
+      <w:r>
+        <w:rPr>
+          <w:bCs/>
+        </w:rPr>
+        <w:t>ie</w:t>
+      </w:r>
+      <w:proofErr w:type="spellEnd"/>
+      <w:r>
+        <w:rPr>
+          <w:bCs/>
+        </w:rPr>
+        <w:t xml:space="preserve"> not using WDISS_WAVEMOD) from WW3 or SWAN. This will compute wave dissipation in ROMS:</w:t>
+      </w:r>
+    </w:p>
+    <w:p>
+      <w:r>
+        <w:rPr>
+          <w:b/>
+        </w:rPr>
+        <w:t>#define</w:t>
+      </w:r>
+      <w:r>
+        <w:rPr>
+          <w:b/>
+        </w:rPr>
+        <w:t xml:space="preserve"> WDISS_THORGUZA </w:t>
+      </w:r>
+      <w:r>
+        <w:t xml:space="preserve"> </w:t>
+      </w:r>
+      <w:r>
+        <w:t xml:space="preserve">      </w:t>
+      </w:r>
+      <w:r>
+        <w:t>wave dissipation from Thorton/Guza</w:t>
+      </w:r>
+    </w:p>
+    <w:p>
+      <w:r>
+        <w:rPr>
+          <w:b/>
+        </w:rPr>
+        <w:t>#defin</w:t>
+      </w:r>
+      <w:r>
+        <w:rPr>
+          <w:b/>
+        </w:rPr>
+        <w:t xml:space="preserve">e WDISS_CHURTHOR </w:t>
+      </w:r>
+      <w:r>
+        <w:t xml:space="preserve">  </w:t>
+      </w:r>
+      <w:r>
+        <w:t xml:space="preserve">     </w:t>
+      </w:r>
+      <w:r>
+        <w:t>wave dissipation from Church/Thorton</w:t>
+      </w:r>
+    </w:p>
+    <w:p>
+      <w:pPr>
+        <w:rPr>
+          <w:b/>
+        </w:rPr>
+      </w:pPr>
+    </w:p>
+    <w:p>
+      <w:pPr>
+        <w:ind w:left="3600" w:hanging="3600"/>
+      </w:pPr>
+      <w:r>
+        <w:t xml:space="preserve">This next option is available with ROMS+SWAN, ROMS+WW3, </w:t>
+      </w:r>
+      <w:r>
+        <w:t>or</w:t>
+      </w:r>
+      <w:r>
+        <w:t xml:space="preserve"> ROMS+INWAVE</w:t>
+      </w:r>
+      <w:r>
+        <w:t>:</w:t>
+      </w:r>
+    </w:p>
+    <w:p>
+      <w:pPr>
+        <w:ind w:left="3600" w:hanging="3600"/>
+        <w:rPr>
+          <w:b/>
+          <w:bCs/>
+        </w:rPr>
+      </w:pPr>
+      <w:r>
+        <w:rPr>
+          <w:b/>
+          <w:bCs/>
+        </w:rPr>
+        <w:t># define DISSIP_BREAK_DIR</w:t>
+      </w:r>
+      <w:r>
+        <w:rPr>
+          <w:b/>
+          <w:bCs/>
+        </w:rPr>
+        <w:tab/>
+      </w:r>
+      <w:r>
+        <w:t xml:space="preserve">use this to </w:t>
+      </w:r>
+      <w:r>
+        <w:t xml:space="preserve">compute and use depth-limited wave </w:t>
+      </w:r>
+      <w:proofErr w:type="spellStart"/>
+      <w:r>
+        <w:t>reaking</w:t>
+      </w:r>
+      <w:proofErr w:type="spellEnd"/>
+      <w:r>
+        <w:t xml:space="preserve"> dissipation in x- and y- directions instead of using the full value and </w:t>
+      </w:r>
+      <w:proofErr w:type="spellStart"/>
+      <w:r>
+        <w:t>Dwave</w:t>
+      </w:r>
+      <w:proofErr w:type="spellEnd"/>
+      <w:r>
+        <w:t xml:space="preserve"> to determine the directions.</w:t>
+      </w:r>
+    </w:p>
+    <w:p>
+      <w:pPr>
+        <w:ind w:left="3600" w:hanging="3600"/>
+        <w:rPr>
+          <w:b/>
+        </w:rPr>
+      </w:pPr>
+    </w:p>
+    <w:p>
+      <w:pPr>
+        <w:ind w:left="3600" w:hanging="3600"/>
+      </w:pPr>
+      <w:r>
+        <w:t xml:space="preserve">This next option is available with ROMS+SWAN, ROMS+WW3, </w:t>
+      </w:r>
+      <w:r>
+        <w:t>or</w:t>
+      </w:r>
+      <w:r>
+        <w:t xml:space="preserve"> ROMS+INWAVE</w:t>
+      </w:r>
+      <w:r>
+        <w:t>:</w:t>
+      </w:r>
+    </w:p>
+    <w:p>
+      <w:pPr>
+        <w:rPr>
+          <w:bCs/>
+        </w:rPr>
+      </w:pPr>
+      <w:r>
+        <w:rPr>
+          <w:bCs/>
+        </w:rPr>
+        <w:t>Select one of the 3 following options for a roller model.</w:t>
+      </w:r>
+    </w:p>
+    <w:p>
+      <w:r>
+        <w:rPr>
+          <w:b/>
+        </w:rPr>
+        <w:t>#define</w:t>
+      </w:r>
+      <w:r>
+        <w:t xml:space="preserve"> </w:t>
+      </w:r>
+      <w:r>
+        <w:rPr>
+          <w:b/>
+        </w:rPr>
+        <w:t>ROLLER_SVENDSEN</w:t>
+      </w:r>
+      <w:r>
+        <w:t xml:space="preserve">  </w:t>
+      </w:r>
+      <w:r>
+        <w:t xml:space="preserve">    </w:t>
+      </w:r>
+      <w:r>
+        <w:t>wave roller based on Svendsen</w:t>
+      </w:r>
+    </w:p>
+    <w:p>
+      <w:r>
+        <w:rPr>
+          <w:b/>
+        </w:rPr>
+        <w:t>#define</w:t>
+      </w:r>
+      <w:r>
+        <w:t xml:space="preserve"> </w:t>
+      </w:r>
+      <w:r>
+        <w:rPr>
+          <w:b/>
+        </w:rPr>
+        <w:t>ROLLER_MONO</w:t>
+      </w:r>
+      <w:r>
+        <w:t xml:space="preserve">            </w:t>
+      </w:r>
+      <w:r>
+        <w:t xml:space="preserve">   w</w:t>
+      </w:r>
+      <w:r>
+        <w:t xml:space="preserve">ave roller for </w:t>
+      </w:r>
+      <w:proofErr w:type="spellStart"/>
+      <w:r>
+        <w:t>monchromatic</w:t>
+      </w:r>
+      <w:proofErr w:type="spellEnd"/>
+      <w:r>
+        <w:t xml:space="preserve"> waves</w:t>
+      </w:r>
+    </w:p>
+    <w:p>
+      <w:r>
+        <w:rPr>
+          <w:b/>
+        </w:rPr>
+        <w:t>#define</w:t>
+      </w:r>
+      <w:r>
+        <w:t xml:space="preserve"> </w:t>
+      </w:r>
+      <w:r>
+        <w:rPr>
+          <w:b/>
+        </w:rPr>
+        <w:t>ROLLER_RENIERS</w:t>
+      </w:r>
+      <w:r>
+        <w:t xml:space="preserve">      </w:t>
+      </w:r>
+      <w:r>
+        <w:t xml:space="preserve">   </w:t>
+      </w:r>
+      <w:r>
+        <w:t xml:space="preserve"> wave roller based on Reniers</w:t>
+      </w:r>
+      <w:r>
+        <w:t xml:space="preserve">  - suggested.</w:t>
+      </w:r>
+    </w:p>
+    <w:p>
+      <w:pPr>
+        <w:rPr>
+          <w:b/>
+        </w:rPr>
+      </w:pPr>
+    </w:p>
+    <w:p>
+      <w:pPr>
+        <w:rPr>
+          <w:bCs/>
+        </w:rPr>
+      </w:pPr>
+      <w:r>
+        <w:t>Th</w:t>
+      </w:r>
+      <w:r>
+        <w:t xml:space="preserve">ese </w:t>
+      </w:r>
+      <w:r>
+        <w:t>next option</w:t>
+      </w:r>
+      <w:r>
+        <w:t>s are</w:t>
+      </w:r>
+      <w:r>
+        <w:t xml:space="preserve"> available with ROMS+SWAN, ROMS+WW3, </w:t>
+      </w:r>
+      <w:r>
+        <w:t>or</w:t>
+      </w:r>
+      <w:r>
+        <w:t xml:space="preserve"> ROMS+INWAVE</w:t>
+      </w:r>
+      <w:r>
+        <w:t xml:space="preserve">: </w:t>
+      </w:r>
+      <w:r>
+        <w:rPr>
+          <w:bCs/>
+        </w:rPr>
+        <w:t xml:space="preserve">Select one or both of </w:t>
+      </w:r>
+      <w:r>
+        <w:rPr>
+          <w:bCs/>
+        </w:rPr>
+        <w:t xml:space="preserve">the bottom and/or surface </w:t>
+      </w:r>
+      <w:r>
+        <w:rPr>
+          <w:bCs/>
+        </w:rPr>
+        <w:t>wave streaming.</w:t>
+      </w:r>
+    </w:p>
+    <w:p>
+      <w:r>
+        <w:rPr>
+          <w:b/>
+        </w:rPr>
+        <w:t>#define</w:t>
+      </w:r>
+      <w:r>
+        <w:t xml:space="preserve"> </w:t>
+      </w:r>
+      <w:r>
+        <w:rPr>
+          <w:b/>
+        </w:rPr>
+        <w:t>BOTTOM_STREAMING</w:t>
+      </w:r>
+      <w:r>
+        <w:t xml:space="preserve"> </w:t>
+      </w:r>
+      <w:r>
+        <w:t xml:space="preserve"> </w:t>
+      </w:r>
+      <w:r>
+        <w:t>wave enhanced bottom streaming</w:t>
+      </w:r>
+    </w:p>
+    <w:p>
+      <w:r>
+        <w:t xml:space="preserve"> If you defined bottom streaming, then you can also select one of these 2 options:</w:t>
+      </w:r>
+    </w:p>
+    <w:p>
+      <w:pPr>
+        <w:rPr>
+          <w:b/>
+          <w:bCs/>
+        </w:rPr>
+      </w:pPr>
+      <w:r>
+        <w:rPr>
+          <w:b/>
+          <w:bCs/>
+        </w:rPr>
+        <w:t>#define BOTTOM_STREAMING_YU</w:t>
+      </w:r>
+    </w:p>
+    <w:p>
+      <w:pPr>
+        <w:rPr>
+          <w:b/>
+          <w:bCs/>
+        </w:rPr>
+      </w:pPr>
+      <w:r>
+        <w:rPr>
+          <w:b/>
+          <w:bCs/>
+        </w:rPr>
+        <w:t>#define BOTTOM_STREAMING_XU_BOWEN</w:t>
+      </w:r>
+    </w:p>
+    <w:p/>
+    <w:p>
+      <w:r>
+        <w:rPr>
+          <w:b/>
+        </w:rPr>
+        <w:t>#define</w:t>
+      </w:r>
+      <w:r>
+        <w:t xml:space="preserve"> </w:t>
+      </w:r>
+      <w:r>
+        <w:rPr>
+          <w:b/>
+        </w:rPr>
+        <w:t>SURFACE_STREAMING</w:t>
+      </w:r>
+      <w:r>
+        <w:t xml:space="preserve"> </w:t>
+      </w:r>
+      <w:r>
+        <w:t>wave enhanced surface streaming</w:t>
+      </w:r>
+    </w:p>
+    <w:p/>
+    <w:p>
+      <w:r>
+        <w:t>4.3</w:t>
+      </w:r>
+      <w:r>
+        <w:t>.</w:t>
+      </w:r>
+      <w:r>
+        <w:t>8</w:t>
+      </w:r>
+      <w:r>
+        <w:t>) Drag limiter option.</w:t>
+      </w:r>
+    </w:p>
+    <w:p>
+      <w:r>
+        <w:rPr>
+          <w:b/>
+        </w:rPr>
+        <w:t>#define</w:t>
+      </w:r>
+      <w:r>
+        <w:t xml:space="preserve"> </w:t>
+      </w:r>
+      <w:r>
+        <w:rPr>
+          <w:b/>
+        </w:rPr>
+        <w:t>DRAGLIM_DAVIS</w:t>
+      </w:r>
+      <w:r>
+        <w:t xml:space="preserve"> is a feature added to WRF and SWAN to limit the ocean roughness drag to be a maximum of 2.85E-3, as detailed in</w:t>
+      </w:r>
+      <w:r>
+        <w:t>:</w:t>
+      </w:r>
+    </w:p>
+    <w:p>
+      <w:r>
+        <w:t>Davis et al, Prediction of Landfall Hurricanes with the Advanced Hurricane WRF Model, Monthly Weather Review, 136, pp 1990-2005.</w:t>
+      </w:r>
+    </w:p>
+    <w:p/>
+    <w:p>
+      <w:r>
+        <w:t xml:space="preserve">In SWAN, this can be activated when using the Komen wind input. For WRF, it can be activated when using </w:t>
+      </w:r>
+      <w:proofErr w:type="spellStart"/>
+      <w:r>
+        <w:t>myjsfc</w:t>
+      </w:r>
+      <w:proofErr w:type="spellEnd"/>
+      <w:r>
+        <w:t xml:space="preserve"> or </w:t>
+      </w:r>
+      <w:proofErr w:type="spellStart"/>
+      <w:r>
+        <w:t>mynn</w:t>
+      </w:r>
+      <w:proofErr w:type="spellEnd"/>
+      <w:r>
+        <w:t xml:space="preserve"> surface layer options.</w:t>
+      </w:r>
+    </w:p>
+    <w:p/>
+    <w:p>
+      <w:r>
+        <w:t>4.</w:t>
+      </w:r>
+      <w:r>
+        <w:t>3</w:t>
+      </w:r>
+      <w:r>
+        <w:t>.</w:t>
+      </w:r>
+      <w:r>
+        <w:t>9</w:t>
+      </w:r>
+      <w:r>
+        <w:t>) Vegetation options.</w:t>
+      </w:r>
+    </w:p>
+    <w:p>
+      <w:r>
         <w:lastRenderedPageBreak/>
-        <w:t>#define</w:t>
-      </w:r>
-      <w:r>
-        <w:t xml:space="preserve"> </w:t>
-      </w:r>
-      <w:r>
-        <w:rPr>
-          <w:b/>
-        </w:rPr>
-        <w:t>WDISS_WAVEMOD</w:t>
-      </w:r>
-      <w:r>
-        <w:t xml:space="preserve">        get </w:t>
-      </w:r>
-      <w:r>
-        <w:t xml:space="preserve">depth-limited wave breaking </w:t>
-      </w:r>
-      <w:r>
-        <w:t>dissipation from a wave model, use this to get dissipation when coupl</w:t>
-      </w:r>
-      <w:r>
-        <w:t xml:space="preserve">ing </w:t>
-      </w:r>
-      <w:r>
-        <w:t>ROMS to either WW3 or SWAN.</w:t>
-      </w:r>
-    </w:p>
-    <w:p>
-      <w:pPr>
-        <w:ind w:left="3510" w:hanging="3510"/>
-        <w:rPr>
-          <w:b/>
-        </w:rPr>
-      </w:pPr>
-    </w:p>
-    <w:p>
-      <w:pPr>
-        <w:rPr>
-          <w:bCs/>
-        </w:rPr>
-      </w:pPr>
-      <w:r>
-        <w:rPr>
-          <w:bCs/>
-        </w:rPr>
-        <w:t xml:space="preserve">Use </w:t>
-      </w:r>
-      <w:r>
-        <w:rPr>
-          <w:bCs/>
-        </w:rPr>
-        <w:t xml:space="preserve">either of these 2 </w:t>
-      </w:r>
-      <w:r>
-        <w:rPr>
-          <w:bCs/>
-        </w:rPr>
-        <w:t xml:space="preserve">below </w:t>
-      </w:r>
-      <w:r>
-        <w:rPr>
-          <w:bCs/>
-        </w:rPr>
-        <w:t>when you are not getting depth limited wave breaking dissipation (</w:t>
-      </w:r>
-      <w:proofErr w:type="spellStart"/>
-      <w:r>
-        <w:rPr>
-          <w:bCs/>
-        </w:rPr>
-        <w:t>ie</w:t>
-      </w:r>
-      <w:proofErr w:type="spellEnd"/>
-      <w:r>
-        <w:rPr>
-          <w:bCs/>
-        </w:rPr>
-        <w:t xml:space="preserve"> not using WDISS_WAVEMOD) from WW3 or SWAN. This will compute wave dissipation in ROMS:</w:t>
-      </w:r>
-    </w:p>
-    <w:p>
-      <w:r>
-        <w:rPr>
-          <w:b/>
-        </w:rPr>
-        <w:t>#define</w:t>
-      </w:r>
-      <w:r>
-        <w:rPr>
-          <w:b/>
-        </w:rPr>
-        <w:t xml:space="preserve"> WDISS_THORGUZA </w:t>
-      </w:r>
-      <w:r>
-        <w:t xml:space="preserve"> </w:t>
-      </w:r>
-      <w:r>
-        <w:t xml:space="preserve">      </w:t>
-      </w:r>
-      <w:r>
-        <w:t>wave dissipation from Thorton/Guza</w:t>
-      </w:r>
-    </w:p>
-    <w:p>
-      <w:r>
-        <w:rPr>
-          <w:b/>
-        </w:rPr>
-        <w:t>#defin</w:t>
-      </w:r>
-      <w:r>
-        <w:rPr>
-          <w:b/>
-        </w:rPr>
-        <w:t xml:space="preserve">e WDISS_CHURTHOR </w:t>
-      </w:r>
-      <w:r>
-        <w:t xml:space="preserve">  </w:t>
-      </w:r>
-      <w:r>
-        <w:t xml:space="preserve">     </w:t>
-      </w:r>
-      <w:r>
-        <w:t>wave dissipation from Church/Thorton</w:t>
-      </w:r>
-    </w:p>
-    <w:p>
-      <w:pPr>
-        <w:rPr>
-          <w:b/>
-        </w:rPr>
-      </w:pPr>
-    </w:p>
-    <w:p>
-      <w:pPr>
-        <w:ind w:left="3600" w:hanging="3600"/>
-      </w:pPr>
-      <w:r>
-        <w:t xml:space="preserve">This next option is available with ROMS+SWAN, ROMS+WW3, </w:t>
-      </w:r>
-      <w:r>
-        <w:t>or</w:t>
-      </w:r>
-      <w:r>
-        <w:t xml:space="preserve"> ROMS+INWAVE</w:t>
-      </w:r>
-      <w:r>
-        <w:t>:</w:t>
-      </w:r>
-    </w:p>
-    <w:p>
-      <w:pPr>
-        <w:ind w:left="3600" w:hanging="3600"/>
-        <w:rPr>
-          <w:b/>
-          <w:bCs/>
-        </w:rPr>
-      </w:pPr>
-      <w:r>
-        <w:rPr>
-          <w:b/>
-          <w:bCs/>
-        </w:rPr>
-        <w:t># define DISSIP_BREAK_DIR</w:t>
-      </w:r>
-      <w:r>
-        <w:rPr>
-          <w:b/>
-          <w:bCs/>
-        </w:rPr>
-        <w:tab/>
-      </w:r>
-      <w:r>
-        <w:t xml:space="preserve">use this to </w:t>
-      </w:r>
-      <w:r>
-        <w:t xml:space="preserve">compute and use depth-limited wave </w:t>
-      </w:r>
-      <w:proofErr w:type="spellStart"/>
-      <w:r>
-        <w:t>reaking</w:t>
-      </w:r>
-      <w:proofErr w:type="spellEnd"/>
-      <w:r>
-        <w:t xml:space="preserve"> dissipation in x- and y- directions instead of using the full value and </w:t>
-      </w:r>
-      <w:proofErr w:type="spellStart"/>
-      <w:r>
-        <w:t>Dwave</w:t>
-      </w:r>
-      <w:proofErr w:type="spellEnd"/>
-      <w:r>
-        <w:t xml:space="preserve"> to determine the directions.</w:t>
-      </w:r>
-    </w:p>
-    <w:p>
-      <w:pPr>
-        <w:ind w:left="3600" w:hanging="3600"/>
-        <w:rPr>
-          <w:b/>
-        </w:rPr>
-      </w:pPr>
-    </w:p>
-    <w:p>
-      <w:pPr>
-        <w:ind w:left="3600" w:hanging="3600"/>
-      </w:pPr>
-      <w:r>
-        <w:t xml:space="preserve">This next option is available with ROMS+SWAN, ROMS+WW3, </w:t>
-      </w:r>
-      <w:r>
-        <w:t>or</w:t>
-      </w:r>
-      <w:r>
-        <w:t xml:space="preserve"> ROMS+INWAVE</w:t>
-      </w:r>
-      <w:r>
-        <w:t>:</w:t>
-      </w:r>
-    </w:p>
-    <w:p>
-      <w:pPr>
-        <w:rPr>
-          <w:bCs/>
-        </w:rPr>
-      </w:pPr>
-      <w:r>
-        <w:rPr>
-          <w:bCs/>
-        </w:rPr>
-        <w:t>Select one of the 3 following options for a roller model.</w:t>
-      </w:r>
-    </w:p>
-    <w:p>
-      <w:r>
-        <w:rPr>
-          <w:b/>
-        </w:rPr>
-        <w:t>#define</w:t>
-      </w:r>
-      <w:r>
-        <w:t xml:space="preserve"> </w:t>
-      </w:r>
-      <w:r>
-        <w:rPr>
-          <w:b/>
-        </w:rPr>
-        <w:t>ROLLER_SVENDSEN</w:t>
-      </w:r>
-      <w:r>
-        <w:t xml:space="preserve">  </w:t>
-      </w:r>
-      <w:r>
-        <w:t xml:space="preserve">    </w:t>
-      </w:r>
-      <w:r>
-        <w:t>wave roller based on Svendsen</w:t>
-      </w:r>
-    </w:p>
-    <w:p>
-      <w:r>
-        <w:rPr>
-          <w:b/>
-        </w:rPr>
-        <w:t>#define</w:t>
-      </w:r>
-      <w:r>
-        <w:t xml:space="preserve"> </w:t>
-      </w:r>
-      <w:r>
-        <w:rPr>
-          <w:b/>
-        </w:rPr>
-        <w:t>ROLLER_MONO</w:t>
-      </w:r>
-      <w:r>
-        <w:t xml:space="preserve">            </w:t>
-      </w:r>
-      <w:r>
-        <w:t xml:space="preserve">   w</w:t>
-      </w:r>
-      <w:r>
-        <w:t xml:space="preserve">ave roller for </w:t>
-      </w:r>
-      <w:proofErr w:type="spellStart"/>
-      <w:r>
-        <w:t>monchromatic</w:t>
-      </w:r>
-      <w:proofErr w:type="spellEnd"/>
-      <w:r>
-        <w:t xml:space="preserve"> waves</w:t>
-      </w:r>
-    </w:p>
-    <w:p>
-      <w:r>
-        <w:rPr>
-          <w:b/>
-        </w:rPr>
-        <w:t>#define</w:t>
-      </w:r>
-      <w:r>
-        <w:t xml:space="preserve"> </w:t>
-      </w:r>
-      <w:r>
-        <w:rPr>
-          <w:b/>
-        </w:rPr>
-        <w:t>ROLLER_RENIERS</w:t>
-      </w:r>
-      <w:r>
-        <w:t xml:space="preserve">      </w:t>
-      </w:r>
-      <w:r>
-        <w:t xml:space="preserve">   </w:t>
-      </w:r>
-      <w:r>
-        <w:t xml:space="preserve"> wave roller based on Reniers</w:t>
-      </w:r>
-      <w:r>
-        <w:t xml:space="preserve">  - suggested.</w:t>
-      </w:r>
-    </w:p>
-    <w:p>
-      <w:pPr>
-        <w:rPr>
-          <w:b/>
-        </w:rPr>
-      </w:pPr>
-    </w:p>
-    <w:p>
-      <w:pPr>
-        <w:rPr>
-          <w:bCs/>
-        </w:rPr>
-      </w:pPr>
-      <w:r>
-        <w:t>Th</w:t>
-      </w:r>
-      <w:r>
-        <w:t xml:space="preserve">ese </w:t>
-      </w:r>
-      <w:r>
-        <w:t>next option</w:t>
-      </w:r>
-      <w:r>
-        <w:t>s are</w:t>
-      </w:r>
-      <w:r>
-        <w:t xml:space="preserve"> available with ROMS+SWAN, ROMS+WW3, </w:t>
-      </w:r>
-      <w:r>
-        <w:t>or</w:t>
-      </w:r>
-      <w:r>
-        <w:t xml:space="preserve"> ROMS+INWAVE</w:t>
-      </w:r>
-      <w:r>
-        <w:t xml:space="preserve">: </w:t>
-      </w:r>
-      <w:r>
-        <w:rPr>
-          <w:bCs/>
-        </w:rPr>
-        <w:t xml:space="preserve">Select one or both of </w:t>
-      </w:r>
-      <w:r>
-        <w:rPr>
-          <w:bCs/>
-        </w:rPr>
-        <w:t xml:space="preserve">the bottom and/or surface </w:t>
-      </w:r>
-      <w:r>
-        <w:rPr>
-          <w:bCs/>
-        </w:rPr>
-        <w:t>wave streaming.</w:t>
-      </w:r>
-    </w:p>
-    <w:p>
-      <w:r>
-        <w:rPr>
-          <w:b/>
-        </w:rPr>
-        <w:t>#define</w:t>
-      </w:r>
-      <w:r>
-        <w:t xml:space="preserve"> </w:t>
-      </w:r>
-      <w:r>
-        <w:rPr>
-          <w:b/>
-        </w:rPr>
-        <w:t>BOTTOM_STREAMING</w:t>
-      </w:r>
-      <w:r>
-        <w:t xml:space="preserve"> </w:t>
-      </w:r>
-      <w:r>
-        <w:t xml:space="preserve"> </w:t>
-      </w:r>
-      <w:r>
-        <w:t>wave enhanced bottom streaming</w:t>
-      </w:r>
-    </w:p>
-    <w:p>
-      <w:r>
-        <w:t xml:space="preserve"> If you defined bottom streaming, then you can also select one of these 2 options:</w:t>
-      </w:r>
-    </w:p>
-    <w:p>
-      <w:pPr>
-        <w:rPr>
-          <w:b/>
-          <w:bCs/>
-        </w:rPr>
-      </w:pPr>
-      <w:r>
-        <w:rPr>
-          <w:b/>
-          <w:bCs/>
-        </w:rPr>
-        <w:t>#define BOTTOM_STREAMING_YU</w:t>
-      </w:r>
-    </w:p>
-    <w:p>
-      <w:pPr>
-        <w:rPr>
-          <w:b/>
-          <w:bCs/>
-        </w:rPr>
-      </w:pPr>
-      <w:r>
-        <w:rPr>
-          <w:b/>
-          <w:bCs/>
-        </w:rPr>
-        <w:t>#define BOTTOM_STREAMING_XU_BOWEN</w:t>
-      </w:r>
-    </w:p>
-    <w:p/>
-    <w:p>
-      <w:r>
-        <w:rPr>
-          <w:b/>
-        </w:rPr>
-        <w:t>#define</w:t>
-      </w:r>
-      <w:r>
-        <w:t xml:space="preserve"> </w:t>
-      </w:r>
-      <w:r>
-        <w:rPr>
-          <w:b/>
-        </w:rPr>
-        <w:t>SURFACE_STREAMING</w:t>
-      </w:r>
-      <w:r>
-        <w:t xml:space="preserve"> </w:t>
-      </w:r>
-      <w:r>
-        <w:t>wave enhanced surface streaming</w:t>
-      </w:r>
-    </w:p>
-    <w:p/>
-    <w:p>
-      <w:r>
-        <w:t>4.3</w:t>
-      </w:r>
-      <w:r>
-        <w:t>.</w:t>
-      </w:r>
-      <w:r>
-        <w:t>8</w:t>
-      </w:r>
-      <w:r>
-        <w:t>) Drag limiter option.</w:t>
-      </w:r>
-    </w:p>
-    <w:p>
-      <w:r>
-        <w:rPr>
-          <w:b/>
-        </w:rPr>
-        <w:t>#define</w:t>
-      </w:r>
-      <w:r>
-        <w:t xml:space="preserve"> </w:t>
-      </w:r>
-      <w:r>
-        <w:rPr>
-          <w:b/>
-        </w:rPr>
-        <w:t>DRAGLIM_DAVIS</w:t>
-      </w:r>
-      <w:r>
-        <w:t xml:space="preserve"> is a feature added to WRF and SWAN to limit the ocean roughness drag to be a maximum of 2.85E-3, as detailed in</w:t>
-      </w:r>
-      <w:r>
-        <w:t>:</w:t>
-      </w:r>
-    </w:p>
-    <w:p>
-      <w:r>
-        <w:t>Davis et al, Prediction of Landfall Hurricanes with the Advanced Hurricane WRF Model, Monthly Weather Review, 136, pp 1990-2005.</w:t>
-      </w:r>
-    </w:p>
-    <w:p/>
-    <w:p>
-      <w:r>
-        <w:t xml:space="preserve">In SWAN, this can be activated when using the Komen wind input. For WRF, it can be activated when using </w:t>
-      </w:r>
-      <w:proofErr w:type="spellStart"/>
-      <w:r>
-        <w:t>myjsfc</w:t>
-      </w:r>
-      <w:proofErr w:type="spellEnd"/>
-      <w:r>
-        <w:t xml:space="preserve"> or </w:t>
-      </w:r>
-      <w:proofErr w:type="spellStart"/>
-      <w:r>
-        <w:t>mynn</w:t>
-      </w:r>
-      <w:proofErr w:type="spellEnd"/>
-      <w:r>
-        <w:t xml:space="preserve"> surface layer options.</w:t>
-      </w:r>
-    </w:p>
-    <w:p/>
-    <w:p>
-      <w:r>
-        <w:t>4.</w:t>
-      </w:r>
-      <w:r>
-        <w:t>3</w:t>
-      </w:r>
-      <w:r>
-        <w:t>.</w:t>
-      </w:r>
-      <w:r>
-        <w:t>9</w:t>
-      </w:r>
-      <w:r>
-        <w:t>) Vegetation options.</w:t>
-      </w:r>
-    </w:p>
-    <w:p>
-      <w:r>
         <w:t xml:space="preserve">Vegetation module was added to get the 3-D effect of vegetation on wave and current fields. Details of the implementation are in this paper: </w:t>
       </w:r>
     </w:p>
@@ -8962,48 +9023,6 @@
         <w:ind w:left="4140" w:hanging="4140"/>
       </w:pPr>
       <w:r>
-        <w:t xml:space="preserve"># </w:t>
-      </w:r>
-      <w:r>
-        <w:rPr>
-          <w:b/>
-        </w:rPr>
-        <w:t>define ACX_ADVECTION</w:t>
-      </w:r>
-      <w:r>
-        <w:t xml:space="preserve">       use to turn ON or OFF advection of Ac in the xi direction</w:t>
-      </w:r>
-    </w:p>
-    <w:p>
-      <w:pPr>
-        <w:ind w:left="4140" w:hanging="4140"/>
-      </w:pPr>
-      <w:r>
-        <w:t xml:space="preserve"># </w:t>
-      </w:r>
-      <w:r>
-        <w:rPr>
-          <w:b/>
-        </w:rPr>
-        <w:t>define ACY_ADVECTION</w:t>
-      </w:r>
-      <w:r>
-        <w:t xml:space="preserve">       use to turn ON or OFF advection of Ac in the </w:t>
-      </w:r>
-      <w:proofErr w:type="spellStart"/>
-      <w:r>
-        <w:t>etai</w:t>
-      </w:r>
-      <w:proofErr w:type="spellEnd"/>
-      <w:r>
-        <w:t xml:space="preserve"> direction</w:t>
-      </w:r>
-    </w:p>
-    <w:p>
-      <w:pPr>
-        <w:ind w:left="4140" w:hanging="4140"/>
-      </w:pPr>
-      <w:r>
         <w:lastRenderedPageBreak/>
         <w:t xml:space="preserve"># </w:t>
       </w:r>
@@ -9011,6 +9030,48 @@
         <w:rPr>
           <w:b/>
         </w:rPr>
+        <w:t>define ACX_ADVECTION</w:t>
+      </w:r>
+      <w:r>
+        <w:t xml:space="preserve">       use to turn ON or OFF advection of Ac in the xi direction</w:t>
+      </w:r>
+    </w:p>
+    <w:p>
+      <w:pPr>
+        <w:ind w:left="4140" w:hanging="4140"/>
+      </w:pPr>
+      <w:r>
+        <w:t xml:space="preserve"># </w:t>
+      </w:r>
+      <w:r>
+        <w:rPr>
+          <w:b/>
+        </w:rPr>
+        <w:t>define ACY_ADVECTION</w:t>
+      </w:r>
+      <w:r>
+        <w:t xml:space="preserve">       use to turn ON or OFF advection of Ac in the </w:t>
+      </w:r>
+      <w:proofErr w:type="spellStart"/>
+      <w:r>
+        <w:t>etai</w:t>
+      </w:r>
+      <w:proofErr w:type="spellEnd"/>
+      <w:r>
+        <w:t xml:space="preserve"> direction</w:t>
+      </w:r>
+    </w:p>
+    <w:p>
+      <w:pPr>
+        <w:ind w:left="4140" w:hanging="4140"/>
+      </w:pPr>
+      <w:r>
+        <w:t xml:space="preserve"># </w:t>
+      </w:r>
+      <w:r>
+        <w:rPr>
+          <w:b/>
+        </w:rPr>
         <w:t>define ACT_ADVECTION</w:t>
       </w:r>
       <w:r>
@@ -9432,6 +9493,7 @@
           <w:b/>
           <w:bCs/>
         </w:rPr>
+        <w:lastRenderedPageBreak/>
         <w:t>#define SSW_ZORIP</w:t>
       </w:r>
       <w:r>
@@ -9895,7 +9957,11 @@
         <w:t xml:space="preserve">in conjunction with </w:t>
       </w:r>
       <w:r>
-        <w:t>SSW BBL) formulation to get current friction factor</w:t>
+        <w:t xml:space="preserve">SSW BBL) formulation to get current friction </w:t>
+      </w:r>
+      <w:r>
+        <w:lastRenderedPageBreak/>
+        <w:t>factor</w:t>
       </w:r>
       <w:r>
         <w:t xml:space="preserve"> and the </w:t>
@@ -9928,11 +9994,7 @@
         <w:t xml:space="preserve"> Compute </w:t>
       </w:r>
       <w:r>
-        <w:t xml:space="preserve">current friction factor with a user defined fixed elevation of wave </w:t>
-      </w:r>
-      <w:r>
-        <w:lastRenderedPageBreak/>
-        <w:t xml:space="preserve">boundary layer. </w:t>
+        <w:t xml:space="preserve">current friction factor with a user defined fixed elevation of wave boundary layer. </w:t>
       </w:r>
       <w:r>
         <w:t>This would go along with</w:t>
@@ -10417,6 +10479,7 @@
     <w:p/>
     <w:p>
       <w:r>
+        <w:lastRenderedPageBreak/>
         <w:t xml:space="preserve">For WAVEWATCH III we now have </w:t>
       </w:r>
       <w:r>
@@ -10882,7 +10945,6 @@
           <w:sz w:val="20"/>
           <w:szCs w:val="20"/>
         </w:rPr>
-        <w:lastRenderedPageBreak/>
         <w:t>### Job name</w:t>
       </w:r>
     </w:p>
@@ -11599,34 +11661,34 @@
     </w:p>
     <w:p>
       <w:r>
-        <w:t xml:space="preserve">- </w:t>
-      </w:r>
-      <w:r>
-        <w:t>If you compiled COAWST for WW3 only, then your run script should point to the ww3_grid.inp for no nesting, or to the ww3_multi.inp for nesting for WW3.</w:t>
-      </w:r>
-    </w:p>
-    <w:p>
-      <w:r>
-        <w:t xml:space="preserve">- </w:t>
-      </w:r>
-      <w:r>
-        <w:t xml:space="preserve">If you compiled COAWST for WRF only, then your run script should point to the </w:t>
-      </w:r>
-      <w:proofErr w:type="spellStart"/>
-      <w:r>
-        <w:t>namelist.input</w:t>
-      </w:r>
-      <w:proofErr w:type="spellEnd"/>
-      <w:r>
-        <w:t xml:space="preserve"> file for WRF.</w:t>
-      </w:r>
-    </w:p>
-    <w:p>
-      <w:r>
         <w:lastRenderedPageBreak/>
         <w:t xml:space="preserve">- </w:t>
       </w:r>
       <w:r>
+        <w:t>If you compiled COAWST for WW3 only, then your run script should point to the ww3_grid.inp for no nesting, or to the ww3_multi.inp for nesting for WW3.</w:t>
+      </w:r>
+    </w:p>
+    <w:p>
+      <w:r>
+        <w:t xml:space="preserve">- </w:t>
+      </w:r>
+      <w:r>
+        <w:t xml:space="preserve">If you compiled COAWST for WRF only, then your run script should point to the </w:t>
+      </w:r>
+      <w:proofErr w:type="spellStart"/>
+      <w:r>
+        <w:t>namelist.input</w:t>
+      </w:r>
+      <w:proofErr w:type="spellEnd"/>
+      <w:r>
+        <w:t xml:space="preserve"> file for WRF.</w:t>
+      </w:r>
+    </w:p>
+    <w:p>
+      <w:r>
+        <w:t xml:space="preserve">- </w:t>
+      </w:r>
+      <w:r>
         <w:t xml:space="preserve">If you compiled COAWST for more than 1 model (coupled), then your </w:t>
       </w:r>
       <w:r>
@@ -11917,6 +11979,7 @@
     </w:p>
     <w:p>
       <w:r>
+        <w:lastRenderedPageBreak/>
         <w:t>! For WW3 uncomment this next line for WW3 yes NESTING.</w:t>
       </w:r>
     </w:p>
@@ -11941,7 +12004,6 @@
     </w:p>
     <w:p>
       <w:r>
-        <w:lastRenderedPageBreak/>
         <w:t xml:space="preserve">  </w:t>
       </w:r>
       <w:proofErr w:type="spellStart"/>
@@ -12231,6 +12293,7 @@
     </w:p>
     <w:p>
       <w:r>
+        <w:lastRenderedPageBreak/>
         <w:t>ROMS_PARENT(1)=0,</w:t>
       </w:r>
     </w:p>
@@ -12247,220 +12310,220 @@
     <w:p/>
     <w:p>
       <w:r>
+        <w:t>Step 4) Enter SWAN information:</w:t>
+      </w:r>
+    </w:p>
+    <w:p>
+      <w:r>
+        <w:t>!    -the name(s) of the SWAN grid file(s) for coords and bathy.</w:t>
+      </w:r>
+    </w:p>
+    <w:p>
+      <w:r>
+        <w:t>!    -the size of the SWAN grids</w:t>
+      </w:r>
+      <w:r>
+        <w:t xml:space="preserve">  (full number of grid center points, this is the same as</w:t>
+      </w:r>
+    </w:p>
+    <w:p>
+      <w:r>
+        <w:t xml:space="preserve">!                                                     size(h) for a </w:t>
+      </w:r>
+      <w:proofErr w:type="spellStart"/>
+      <w:r>
+        <w:t>roms</w:t>
+      </w:r>
+      <w:proofErr w:type="spellEnd"/>
+      <w:r>
+        <w:t xml:space="preserve"> grid)</w:t>
+      </w:r>
+      <w:r>
+        <w:t xml:space="preserve">, and </w:t>
+      </w:r>
+    </w:p>
+    <w:p>
+      <w:r>
+        <w:t>!    -if the swan grids are Spherical(set cartesian=0) or</w:t>
+      </w:r>
+    </w:p>
+    <w:p>
+      <w:r>
+        <w:t>!                           Cartesian(set cartesian=1).</w:t>
+      </w:r>
+    </w:p>
+    <w:p>
+      <w:r>
+        <w:t xml:space="preserve">!    -the parent grid number. For the largest grid: the grid id </w:t>
+      </w:r>
+    </w:p>
+    <w:p>
+      <w:r>
+        <w:t>!                           number is 1 and my parent is 0.SWAN_COORD(1)='../../Projects/Sandy/SWAN/Sandy_swan_coord.grd',</w:t>
+      </w:r>
+    </w:p>
+    <w:p>
+      <w:r>
+        <w:t>SWAN_BATH(1)='../../Projects/Sandy/SWAN/</w:t>
+      </w:r>
+      <w:proofErr w:type="spellStart"/>
+      <w:r>
+        <w:t>Sandy_swan_bathy.bot</w:t>
+      </w:r>
+      <w:proofErr w:type="spellEnd"/>
+      <w:r>
+        <w:t>',</w:t>
+      </w:r>
+    </w:p>
+    <w:p>
+      <w:r>
+        <w:t>SWAN_NUMX(1)=87,</w:t>
+      </w:r>
+    </w:p>
+    <w:p>
+      <w:r>
+        <w:t>SWAN_NUMY(1)=65,</w:t>
+      </w:r>
+    </w:p>
+    <w:p>
+      <w:r>
+        <w:t>SWAN_CARTESIAN(1)=0,</w:t>
+      </w:r>
+    </w:p>
+    <w:p>
+      <w:r>
+        <w:t>SWAN_PARENT(1)=0,</w:t>
+      </w:r>
+    </w:p>
+    <w:p>
+      <w:r>
+        <w:t>SWAN_COORD(2)='../../Projects/Sandy/SWAN/Sandy_swan_child1_coord.grd',</w:t>
+      </w:r>
+    </w:p>
+    <w:p>
+      <w:r>
+        <w:t>SWAN_BATH(2)='../../Projects/Sandy/SWAN/Sandy_swan_child1_bathy.bot',</w:t>
+      </w:r>
+    </w:p>
+    <w:p>
+      <w:r>
+        <w:t>SWAN_NUMX(2)=110,</w:t>
+      </w:r>
+    </w:p>
+    <w:p>
+      <w:r>
+        <w:t>SWAN_NUMY(2)=56,</w:t>
+      </w:r>
+    </w:p>
+    <w:p>
+      <w:r>
+        <w:t>SWAN_CARTESIAN(2)=0,</w:t>
+      </w:r>
+    </w:p>
+    <w:p>
+      <w:r>
+        <w:t>SWAN_PARENT(2)=1,</w:t>
+      </w:r>
+    </w:p>
+    <w:p>
+      <w:r>
+        <w:t>SWAN_COORD(3)='../../Projects/Sandy/SWAN/Sandy_swan_child2_coord.grd',</w:t>
+      </w:r>
+    </w:p>
+    <w:p>
+      <w:r>
+        <w:t>SWAN_BATH(3)='../../Projects/Sandy/SWAN/Sandy_swan_child2_bathy.bot',</w:t>
+      </w:r>
+    </w:p>
+    <w:p>
+      <w:r>
+        <w:t>SWAN_NUMX(3)=98,</w:t>
+      </w:r>
+    </w:p>
+    <w:p>
+      <w:r>
+        <w:t>SWAN_NUMY(3)=44,</w:t>
+      </w:r>
+    </w:p>
+    <w:p>
+      <w:r>
+        <w:t>SWAN_CARTESIAN(3)=0,</w:t>
+      </w:r>
+    </w:p>
+    <w:p>
+      <w:r>
+        <w:t>SWAN_PARENT(3)=1,</w:t>
+      </w:r>
+    </w:p>
+    <w:p/>
+    <w:p>
+      <w:r>
+        <w:t>! 5) Enter WW3 information</w:t>
+      </w:r>
+    </w:p>
+    <w:p>
+      <w:r>
+        <w:t>!    -the name(s) of the WW3 grid file(s) for x- y- coords and bathy.</w:t>
+      </w:r>
+    </w:p>
+    <w:p>
+      <w:r>
+        <w:t xml:space="preserve">!    -the size of the WW3 grids (full number of grid center points). </w:t>
+      </w:r>
+    </w:p>
+    <w:p>
+      <w:r>
+        <w:t>!</w:t>
+      </w:r>
+    </w:p>
+    <w:p>
+      <w:r>
+        <w:t>WW3_XCOORD(1)='../../Projects/Sandy/WW3/ww3_xcoord_Sandy_roms_grid.dat',</w:t>
+      </w:r>
+    </w:p>
+    <w:p>
+      <w:r>
+        <w:t>WW3_YCOORD(1)='../../Projects/Sandy/WW3/ww3_ycoord_Sandy_roms_grid.dat',</w:t>
+      </w:r>
+    </w:p>
+    <w:p>
+      <w:r>
+        <w:t>WW3_BATH(1)='../../Projects/Sandy/WW3/ww3_bathy_Sandy_roms_grid.dat',</w:t>
+      </w:r>
+    </w:p>
+    <w:p>
+      <w:r>
+        <w:t>WW3_NUMX(1)=87,</w:t>
+      </w:r>
+    </w:p>
+    <w:p>
+      <w:r>
+        <w:t>WW3_NUMY(1)=65,</w:t>
+      </w:r>
+    </w:p>
+    <w:p>
+      <w:r>
+        <w:t>WW3_PARENT(1)=0,</w:t>
+      </w:r>
+    </w:p>
+    <w:p>
+      <w:r>
+        <w:t>WW3_XCOORD(2)='../../Projects/Sandy/WW3/ww3_xcoord_Sandy_roms_grid_child1.dat',</w:t>
+      </w:r>
+    </w:p>
+    <w:p>
+      <w:r>
+        <w:t>WW3_YCOORD(2)='../../Projects/Sandy/WW3/ww3_ycoord_Sandy_roms_grid_child1.dat',</w:t>
+      </w:r>
+    </w:p>
+    <w:p>
+      <w:r>
+        <w:t>WW3_BATH(2)='../../Projects/Sandy/WW3/ww3_bathy_Sandy_roms_grid_child1.dat',</w:t>
+      </w:r>
+    </w:p>
+    <w:p>
+      <w:r>
         <w:lastRenderedPageBreak/>
-        <w:t>Step 4) Enter SWAN information:</w:t>
-      </w:r>
-    </w:p>
-    <w:p>
-      <w:r>
-        <w:t>!    -the name(s) of the SWAN grid file(s) for coords and bathy.</w:t>
-      </w:r>
-    </w:p>
-    <w:p>
-      <w:r>
-        <w:t>!    -the size of the SWAN grids</w:t>
-      </w:r>
-      <w:r>
-        <w:t xml:space="preserve">  (full number of grid center points, this is the same as</w:t>
-      </w:r>
-    </w:p>
-    <w:p>
-      <w:r>
-        <w:t xml:space="preserve">!                                                     size(h) for a </w:t>
-      </w:r>
-      <w:proofErr w:type="spellStart"/>
-      <w:r>
-        <w:t>roms</w:t>
-      </w:r>
-      <w:proofErr w:type="spellEnd"/>
-      <w:r>
-        <w:t xml:space="preserve"> grid)</w:t>
-      </w:r>
-      <w:r>
-        <w:t xml:space="preserve">, and </w:t>
-      </w:r>
-    </w:p>
-    <w:p>
-      <w:r>
-        <w:t>!    -if the swan grids are Spherical(set cartesian=0) or</w:t>
-      </w:r>
-    </w:p>
-    <w:p>
-      <w:r>
-        <w:t>!                           Cartesian(set cartesian=1).</w:t>
-      </w:r>
-    </w:p>
-    <w:p>
-      <w:r>
-        <w:t xml:space="preserve">!    -the parent grid number. For the largest grid: the grid id </w:t>
-      </w:r>
-    </w:p>
-    <w:p>
-      <w:r>
-        <w:t>!                           number is 1 and my parent is 0.SWAN_COORD(1)='../../Projects/Sandy/SWAN/Sandy_swan_coord.grd',</w:t>
-      </w:r>
-    </w:p>
-    <w:p>
-      <w:r>
-        <w:t>SWAN_BATH(1)='../../Projects/Sandy/SWAN/</w:t>
-      </w:r>
-      <w:proofErr w:type="spellStart"/>
-      <w:r>
-        <w:t>Sandy_swan_bathy.bot</w:t>
-      </w:r>
-      <w:proofErr w:type="spellEnd"/>
-      <w:r>
-        <w:t>',</w:t>
-      </w:r>
-    </w:p>
-    <w:p>
-      <w:r>
-        <w:t>SWAN_NUMX(1)=87,</w:t>
-      </w:r>
-    </w:p>
-    <w:p>
-      <w:r>
-        <w:t>SWAN_NUMY(1)=65,</w:t>
-      </w:r>
-    </w:p>
-    <w:p>
-      <w:r>
-        <w:t>SWAN_CARTESIAN(1)=0,</w:t>
-      </w:r>
-    </w:p>
-    <w:p>
-      <w:r>
-        <w:t>SWAN_PARENT(1)=0,</w:t>
-      </w:r>
-    </w:p>
-    <w:p>
-      <w:r>
-        <w:t>SWAN_COORD(2)='../../Projects/Sandy/SWAN/Sandy_swan_child1_coord.grd',</w:t>
-      </w:r>
-    </w:p>
-    <w:p>
-      <w:r>
-        <w:t>SWAN_BATH(2)='../../Projects/Sandy/SWAN/Sandy_swan_child1_bathy.bot',</w:t>
-      </w:r>
-    </w:p>
-    <w:p>
-      <w:r>
-        <w:t>SWAN_NUMX(2)=110,</w:t>
-      </w:r>
-    </w:p>
-    <w:p>
-      <w:r>
-        <w:t>SWAN_NUMY(2)=56,</w:t>
-      </w:r>
-    </w:p>
-    <w:p>
-      <w:r>
-        <w:t>SWAN_CARTESIAN(2)=0,</w:t>
-      </w:r>
-    </w:p>
-    <w:p>
-      <w:r>
-        <w:t>SWAN_PARENT(2)=1,</w:t>
-      </w:r>
-    </w:p>
-    <w:p>
-      <w:r>
-        <w:t>SWAN_COORD(3)='../../Projects/Sandy/SWAN/Sandy_swan_child2_coord.grd',</w:t>
-      </w:r>
-    </w:p>
-    <w:p>
-      <w:r>
-        <w:t>SWAN_BATH(3)='../../Projects/Sandy/SWAN/Sandy_swan_child2_bathy.bot',</w:t>
-      </w:r>
-    </w:p>
-    <w:p>
-      <w:r>
-        <w:t>SWAN_NUMX(3)=98,</w:t>
-      </w:r>
-    </w:p>
-    <w:p>
-      <w:r>
-        <w:t>SWAN_NUMY(3)=44,</w:t>
-      </w:r>
-    </w:p>
-    <w:p>
-      <w:r>
-        <w:t>SWAN_CARTESIAN(3)=0,</w:t>
-      </w:r>
-    </w:p>
-    <w:p>
-      <w:r>
-        <w:t>SWAN_PARENT(3)=1,</w:t>
-      </w:r>
-    </w:p>
-    <w:p/>
-    <w:p>
-      <w:r>
-        <w:t>! 5) Enter WW3 information</w:t>
-      </w:r>
-    </w:p>
-    <w:p>
-      <w:r>
-        <w:t>!    -the name(s) of the WW3 grid file(s) for x- y- coords and bathy.</w:t>
-      </w:r>
-    </w:p>
-    <w:p>
-      <w:r>
-        <w:t xml:space="preserve">!    -the size of the WW3 grids (full number of grid center points). </w:t>
-      </w:r>
-    </w:p>
-    <w:p>
-      <w:r>
-        <w:t>!</w:t>
-      </w:r>
-    </w:p>
-    <w:p>
-      <w:r>
-        <w:t>WW3_XCOORD(1)='../../Projects/Sandy/WW3/ww3_xcoord_Sandy_roms_grid.dat',</w:t>
-      </w:r>
-    </w:p>
-    <w:p>
-      <w:r>
-        <w:t>WW3_YCOORD(1)='../../Projects/Sandy/WW3/ww3_ycoord_Sandy_roms_grid.dat',</w:t>
-      </w:r>
-    </w:p>
-    <w:p>
-      <w:r>
-        <w:t>WW3_BATH(1)='../../Projects/Sandy/WW3/ww3_bathy_Sandy_roms_grid.dat',</w:t>
-      </w:r>
-    </w:p>
-    <w:p>
-      <w:r>
-        <w:t>WW3_NUMX(1)=87,</w:t>
-      </w:r>
-    </w:p>
-    <w:p>
-      <w:r>
-        <w:t>WW3_NUMY(1)=65,</w:t>
-      </w:r>
-    </w:p>
-    <w:p>
-      <w:r>
-        <w:t>WW3_PARENT(1)=0,</w:t>
-      </w:r>
-    </w:p>
-    <w:p>
-      <w:r>
-        <w:t>WW3_XCOORD(2)='../../Projects/Sandy/WW3/ww3_xcoord_Sandy_roms_grid_child1.dat',</w:t>
-      </w:r>
-    </w:p>
-    <w:p>
-      <w:r>
-        <w:t>WW3_YCOORD(2)='../../Projects/Sandy/WW3/ww3_ycoord_Sandy_roms_grid_child1.dat',</w:t>
-      </w:r>
-    </w:p>
-    <w:p>
-      <w:r>
-        <w:t>WW3_BATH(2)='../../Projects/Sandy/WW3/ww3_bathy_Sandy_roms_grid_child1.dat',</w:t>
-      </w:r>
-    </w:p>
-    <w:p>
-      <w:r>
         <w:t>WW3_NUMX(2)=110,</w:t>
       </w:r>
     </w:p>
@@ -12476,7 +12539,6 @@
     </w:p>
     <w:p>
       <w:r>
-        <w:lastRenderedPageBreak/>
         <w:t>WW3_XCOORD(3)='../../Projects/Sandy/WW3/ww3_xcoord_Sandy_roms_grid_child2.dat',</w:t>
       </w:r>
     </w:p>
@@ -12827,6 +12889,7 @@
         <w:outlineLvl w:val="0"/>
       </w:pPr>
       <w:r>
+        <w:lastRenderedPageBreak/>
         <w:t>N=16;</w:t>
       </w:r>
     </w:p>
@@ -13311,12 +13374,12 @@
     </w:p>
     <w:p>
       <w:r>
+        <w:lastRenderedPageBreak/>
         <w:t>BLK_ZW (usually 10m)</w:t>
       </w:r>
     </w:p>
     <w:p>
       <w:r>
-        <w:lastRenderedPageBreak/>
         <w:t>these numbers should be consistent with the height of the levels of the surface variables (as said usually wind is at 10m, air temp at 2m, humidity at 2m, but this might be different depending on your surface forcing dataset).</w:t>
       </w:r>
     </w:p>
@@ -13560,7 +13623,11 @@
         <w:jc w:val="both"/>
       </w:pPr>
       <w:r>
-        <w:t>With this set of commands, swan is going to run from Jan 1, 2000, at hour 0 to Jan 1, 2000 to hour 12, with a 60 sec time step.  The 'RESTART' command will update a file called swan_inlet_rst.dat every 1 hour during that simulation.  You can make this be any time you require (1 HR or 30 MIN or 12 HR or whatever). It is recommended that the user set the restart times to be the same for WRF, ROMS, and SWAN so that a consistent set of restart files are available.</w:t>
+        <w:t xml:space="preserve">With this set of commands, swan is going to run from Jan 1, 2000, at hour 0 to Jan 1, 2000 to hour 12, with a 60 sec time step.  The 'RESTART' command will update a file called swan_inlet_rst.dat every 1 hour during that simulation.  You can make this be any time you require (1 HR or 30 MIN or 12 HR or whatever). It is recommended that the user set the </w:t>
+      </w:r>
+      <w:r>
+        <w:lastRenderedPageBreak/>
+        <w:t>restart times to be the same for WRF, ROMS, and SWAN so that a consistent set of restart files are available.</w:t>
       </w:r>
     </w:p>
     <w:p/>
@@ -14393,7 +14460,11 @@
               <w:jc w:val="both"/>
             </w:pPr>
             <w:r>
-              <w:t>Idealized tropical cyclone that travels west from a deep ocean basin onto a shelf that slopes landward to the west. WRF+ROMS+SWAN with ROMS and SWAN on same grid, WRF on different grid.</w:t>
+              <w:t xml:space="preserve">Idealized tropical cyclone that travels west from a deep ocean basin onto a shelf that slopes landward to the west. </w:t>
+            </w:r>
+            <w:r>
+              <w:lastRenderedPageBreak/>
+              <w:t>WRF+ROMS+SWAN with ROMS and SWAN on same grid, WRF on different grid.</w:t>
             </w:r>
           </w:p>
         </w:tc>
@@ -15033,7 +15104,11 @@
         <w:t>-</w:t>
       </w:r>
       <w:r>
-        <w:t xml:space="preserve">shore array of pressure and velocity sensors that were used to compute water levels and waves and currents. This test case was set up to simulate the data collected in October 1990 with a grid that is 450x180 cells, gid resolution of 2m and 5m, out to the 8m depth array and approximately 900 m along the coast. The eastern boundary was forced with 2D spectra from the 8m array and model results compared to the observations. </w:t>
+        <w:t xml:space="preserve">shore array of pressure and velocity sensors that were used to compute water levels and waves and currents. This test case was set up to simulate the data collected in October 1990 with a grid that is 450x180 cells, gid resolution of 2m and 5m, out to the 8m depth array and approximately 900 m along the coast. The eastern </w:t>
+      </w:r>
+      <w:r>
+        <w:lastRenderedPageBreak/>
+        <w:t xml:space="preserve">boundary was forced with 2D spectra from the 8m array and model results compared to the observations. </w:t>
       </w:r>
     </w:p>
     <w:p>
@@ -15044,7 +15119,6 @@
         <w:rPr>
           <w:noProof/>
         </w:rPr>
-        <w:lastRenderedPageBreak/>
         <w:drawing>
           <wp:inline distT="0" distB="0" distL="0" distR="0" wp14:anchorId="79D7C3A4" wp14:editId="2593B4DD">
             <wp:extent cx="5486400" cy="2033270"/>
@@ -15393,6 +15467,7 @@
         <w:jc w:val="both"/>
       </w:pPr>
       <w:r>
+        <w:lastRenderedPageBreak/>
         <w:t>1) get data for bathy and wave forcing.</w:t>
       </w:r>
     </w:p>
@@ -15401,7 +15476,6 @@
         <w:jc w:val="both"/>
       </w:pPr>
       <w:r>
-        <w:lastRenderedPageBreak/>
         <w:t>We created the m file “</w:t>
       </w:r>
       <w:proofErr w:type="spellStart"/>
@@ -15976,6 +16050,7 @@
         <w:jc w:val="both"/>
       </w:pPr>
       <w:r>
+        <w:lastRenderedPageBreak/>
         <w:t># define WDISS_FRIC</w:t>
       </w:r>
       <w:r>
@@ -15987,7 +16062,6 @@
         <w:jc w:val="both"/>
       </w:pPr>
       <w:r>
-        <w:lastRenderedPageBreak/>
         <w:t># define ROLLER_RENIERS</w:t>
       </w:r>
       <w:r>
@@ -26994,7 +27068,7 @@
           <w:noProof/>
         </w:rPr>
         <w:drawing>
-          <wp:inline distT="0" distB="0" distL="0" distR="0" wp14:anchorId="680D023C" wp14:editId="5ECAF215">
+          <wp:inline distT="0" distB="0" distL="0" distR="0" wp14:anchorId="680D023C" wp14:editId="721B5960">
             <wp:extent cx="3933825" cy="2952750"/>
             <wp:effectExtent l="0" t="0" r="0" b="0"/>
             <wp:docPr id="18" name="Picture 9"/>
@@ -29613,7 +29687,7 @@
         </w:rPr>
         <w:lastRenderedPageBreak/>
         <w:drawing>
-          <wp:inline distT="0" distB="0" distL="0" distR="0" wp14:anchorId="20101E79" wp14:editId="02324D45">
+          <wp:inline distT="0" distB="0" distL="0" distR="0" wp14:anchorId="20101E79" wp14:editId="054CE5DF">
             <wp:extent cx="5486400" cy="3990975"/>
             <wp:effectExtent l="0" t="0" r="0" b="0"/>
             <wp:docPr id="28" name="Picture 3"/>
@@ -46441,7 +46515,7 @@
           <w:noProof/>
         </w:rPr>
         <w:drawing>
-          <wp:inline distT="0" distB="0" distL="0" distR="0" wp14:anchorId="6B0A1485" wp14:editId="4CF8DC90">
+          <wp:inline distT="0" distB="0" distL="0" distR="0" wp14:anchorId="6B0A1485" wp14:editId="6B505EAC">
             <wp:extent cx="2628900" cy="1990725"/>
             <wp:effectExtent l="0" t="0" r="0" b="0"/>
             <wp:docPr id="34" name="Picture 1"/>
@@ -54078,7 +54152,7 @@
           <w:noProof/>
         </w:rPr>
         <w:drawing>
-          <wp:inline distT="0" distB="0" distL="0" distR="0" wp14:anchorId="26AB7E10" wp14:editId="772B235F">
+          <wp:inline distT="0" distB="0" distL="0" distR="0" wp14:anchorId="26AB7E10" wp14:editId="3553CF9C">
             <wp:extent cx="1981200" cy="1714500"/>
             <wp:effectExtent l="0" t="0" r="0" b="0"/>
             <wp:docPr id="39" name="Picture 1"/>
@@ -59353,7 +59427,7 @@
         </w:rPr>
         <w:lastRenderedPageBreak/>
         <w:drawing>
-          <wp:inline distT="0" distB="0" distL="0" distR="0" wp14:anchorId="1C0FFDDD" wp14:editId="621C6A69">
+          <wp:inline distT="0" distB="0" distL="0" distR="0" wp14:anchorId="1C0FFDDD" wp14:editId="0FA48375">
             <wp:extent cx="2352675" cy="2219325"/>
             <wp:effectExtent l="0" t="0" r="0" b="0"/>
             <wp:docPr id="40" name="Picture 1"/>

</xml_diff>

<commit_message>
update WW3 to use OARST, mv COAWST call
</commit_message>
<xml_diff>
--- a/COAWST_User_Manual.docx
+++ b/COAWST_User_Manual.docx
@@ -4233,13 +4233,7 @@
         </w:rPr>
       </w:pPr>
       <w:r>
-        <w:t xml:space="preserve">- To use this option with </w:t>
-      </w:r>
-      <w:r>
-        <w:t>WW3</w:t>
-      </w:r>
-      <w:r>
-        <w:t>, you need to use #</w:t>
+        <w:t>- To use this option with WW3, you need to use #</w:t>
       </w:r>
       <w:r>
         <w:rPr>
@@ -22668,6 +22662,76 @@
           <w:b/>
           <w:bCs/>
         </w:rPr>
+        <w:t>bounc</w:t>
+      </w:r>
+    </w:p>
+    <w:p>
+      <w:r>
+        <w:t>- edit Projects/</w:t>
+      </w:r>
+      <w:proofErr w:type="spellStart"/>
+      <w:r>
+        <w:t>Inlet_test</w:t>
+      </w:r>
+      <w:proofErr w:type="spellEnd"/>
+      <w:r>
+        <w:t>/WW3/ww3_</w:t>
+      </w:r>
+      <w:r>
+        <w:t>bounc</w:t>
+      </w:r>
+      <w:r>
+        <w:t xml:space="preserve">.inp. </w:t>
+      </w:r>
+      <w:r>
+        <w:t xml:space="preserve">This </w:t>
+      </w:r>
+      <w:proofErr w:type="spellStart"/>
+      <w:r>
+        <w:t>inp</w:t>
+      </w:r>
+      <w:proofErr w:type="spellEnd"/>
+      <w:r>
+        <w:t xml:space="preserve"> file will read the ww3_bound_spec.nc file created above, and create a nest.ww3 file that is used as a boundary file. Then run</w:t>
+      </w:r>
+    </w:p>
+    <w:p>
+      <w:r>
+        <w:t>../../../WW3/build/bin/ww3_</w:t>
+      </w:r>
+      <w:r>
+        <w:t>bounc</w:t>
+      </w:r>
+      <w:r>
+        <w:t xml:space="preserve"> to create </w:t>
+      </w:r>
+      <w:r>
+        <w:t>nest</w:t>
+      </w:r>
+      <w:r>
+        <w:t>.ww3.</w:t>
+      </w:r>
+    </w:p>
+    <w:p/>
+    <w:p>
+      <w:pPr>
+        <w:rPr>
+          <w:b/>
+          <w:bCs/>
+        </w:rPr>
+      </w:pPr>
+      <w:r>
+        <w:rPr>
+          <w:b/>
+          <w:bCs/>
+        </w:rPr>
+        <w:t>Utility ww3_</w:t>
+      </w:r>
+      <w:r>
+        <w:rPr>
+          <w:b/>
+          <w:bCs/>
+        </w:rPr>
         <w:t>prep</w:t>
       </w:r>
     </w:p>
@@ -22776,6 +22840,7 @@
     </w:p>
     <w:p>
       <w:r>
+        <w:lastRenderedPageBreak/>
         <w:t xml:space="preserve">   20000101 120000</w:t>
       </w:r>
     </w:p>
@@ -22826,7 +22891,6 @@
     </w:p>
     <w:p>
       <w:r>
-        <w:lastRenderedPageBreak/>
         <w:t xml:space="preserve">  T   </w:t>
       </w:r>
       <w:proofErr w:type="spellStart"/>
@@ -23814,6 +23878,7 @@
     </w:p>
     <w:p>
       <w:r>
+        <w:lastRenderedPageBreak/>
         <w:t># define ACT_ADVECTION</w:t>
       </w:r>
     </w:p>
@@ -23866,7 +23931,6 @@
     </w:p>
     <w:p>
       <w:r>
-        <w:lastRenderedPageBreak/>
         <w:t xml:space="preserve">The “INWAVE_SWAN_COUPLING” </w:t>
       </w:r>
       <w:r>
@@ -27068,7 +27132,7 @@
           <w:noProof/>
         </w:rPr>
         <w:drawing>
-          <wp:inline distT="0" distB="0" distL="0" distR="0" wp14:anchorId="680D023C" wp14:editId="721B5960">
+          <wp:inline distT="0" distB="0" distL="0" distR="0" wp14:anchorId="680D023C" wp14:editId="37D5199D">
             <wp:extent cx="3933825" cy="2952750"/>
             <wp:effectExtent l="0" t="0" r="0" b="0"/>
             <wp:docPr id="18" name="Picture 9"/>
@@ -29687,7 +29751,7 @@
         </w:rPr>
         <w:lastRenderedPageBreak/>
         <w:drawing>
-          <wp:inline distT="0" distB="0" distL="0" distR="0" wp14:anchorId="20101E79" wp14:editId="054CE5DF">
+          <wp:inline distT="0" distB="0" distL="0" distR="0" wp14:anchorId="20101E79" wp14:editId="60805F4E">
             <wp:extent cx="5486400" cy="3990975"/>
             <wp:effectExtent l="0" t="0" r="0" b="0"/>
             <wp:docPr id="28" name="Picture 3"/>
@@ -46515,7 +46579,7 @@
           <w:noProof/>
         </w:rPr>
         <w:drawing>
-          <wp:inline distT="0" distB="0" distL="0" distR="0" wp14:anchorId="6B0A1485" wp14:editId="6B505EAC">
+          <wp:inline distT="0" distB="0" distL="0" distR="0" wp14:anchorId="6B0A1485" wp14:editId="5A6B469A">
             <wp:extent cx="2628900" cy="1990725"/>
             <wp:effectExtent l="0" t="0" r="0" b="0"/>
             <wp:docPr id="34" name="Picture 1"/>
@@ -54152,7 +54216,7 @@
           <w:noProof/>
         </w:rPr>
         <w:drawing>
-          <wp:inline distT="0" distB="0" distL="0" distR="0" wp14:anchorId="26AB7E10" wp14:editId="3553CF9C">
+          <wp:inline distT="0" distB="0" distL="0" distR="0" wp14:anchorId="26AB7E10" wp14:editId="67343F3F">
             <wp:extent cx="1981200" cy="1714500"/>
             <wp:effectExtent l="0" t="0" r="0" b="0"/>
             <wp:docPr id="39" name="Picture 1"/>
@@ -59427,7 +59491,7 @@
         </w:rPr>
         <w:lastRenderedPageBreak/>
         <w:drawing>
-          <wp:inline distT="0" distB="0" distL="0" distR="0" wp14:anchorId="1C0FFDDD" wp14:editId="0FA48375">
+          <wp:inline distT="0" distB="0" distL="0" distR="0" wp14:anchorId="1C0FFDDD" wp14:editId="4FE6E035">
             <wp:extent cx="2352675" cy="2219325"/>
             <wp:effectExtent l="0" t="0" r="0" b="0"/>
             <wp:docPr id="40" name="Picture 1"/>

</xml_diff>